<commit_message>
Guide: Airflow trigger form, run view, Part 7 and Part 10 screenshots
</commit_message>
<xml_diff>
--- a/guide/Lab18_Data_Engineering_Pipeline_Lab_Guide.docx
+++ b/guide/Lab18_Data_Engineering_Pipeline_Lab_Guide.docx
@@ -5294,7 +5294,7 @@
       <w:r>
         <w:drawing>
           <wp:inline xmlns:a="http://schemas.openxmlformats.org/drawingml/2006/main" xmlns:pic="http://schemas.openxmlformats.org/drawingml/2006/picture">
-            <wp:extent cx="6645600" cy="2233904"/>
+            <wp:extent cx="6645600" cy="3179092"/>
             <wp:docPr id="7" name="Picture 7"/>
             <wp:cNvGraphicFramePr>
               <a:graphicFrameLocks noChangeAspect="1"/>
@@ -5315,7 +5315,7 @@
                   <pic:spPr>
                     <a:xfrm>
                       <a:off x="0" y="0"/>
-                      <a:ext cx="6645600" cy="2233904"/>
+                      <a:ext cx="6645600" cy="3179092"/>
                     </a:xfrm>
                     <a:prstGeom prst="rect"/>
                     <a:ln w="9525">
@@ -5345,46 +5345,50 @@
         <w:t>The Airflow DAG list. The churn_pipeline toggle is on, and the play button under Actions opens the trigger form.</w:t>
       </w:r>
     </w:p>
-    <w:tbl>
-      <w:tblPr>
-        <w:tblW w:type="auto" w:w="0"/>
+    <w:p>
+      <w:pPr>
         <w:jc w:val="left"/>
-        <w:tblBorders>
-          <w:top w:val="single" w:sz="4" w:space="0" w:color="B1B9BE"/>
-          <w:left w:val="single" w:sz="4" w:space="0" w:color="B1B9BE"/>
-          <w:bottom w:val="single" w:sz="4" w:space="0" w:color="B1B9BE"/>
-          <w:right w:val="single" w:sz="4" w:space="0" w:color="B1B9BE"/>
-          <w:insideH w:val="single" w:sz="4" w:space="0" w:color="B1B9BE"/>
-          <w:insideV w:val="single" w:sz="4" w:space="0" w:color="B1B9BE"/>
-        </w:tblBorders>
-        <w:tblLook w:firstColumn="1" w:firstRow="1" w:lastColumn="0" w:lastRow="0" w:noHBand="0" w:noVBand="1" w:val="04A0"/>
-      </w:tblPr>
-      <w:tblGrid>
-        <w:gridCol w:w="10466"/>
-      </w:tblGrid>
-      <w:tr>
-        <w:tc>
-          <w:tcPr>
-            <w:tcW w:type="dxa" w:w="10466"/>
-            <w:shd w:val="clear" w:color="auto" w:fill="F2F4F5"/>
-          </w:tcPr>
-          <w:p>
-            <w:pPr>
-              <w:spacing w:before="1200" w:after="1200"/>
-              <w:jc w:val="center"/>
-            </w:pPr>
-            <w:r>
-              <w:rPr>
-                <w:i/>
-                <w:color w:val="595959"/>
-                <w:sz w:val="18"/>
-              </w:rPr>
-              <w:t>Screenshot to be inserted: 05_airflow_trigger.png</w:t>
-            </w:r>
-          </w:p>
-        </w:tc>
-      </w:tr>
-    </w:tbl>
+      </w:pPr>
+      <w:r>
+        <w:drawing>
+          <wp:inline xmlns:a="http://schemas.openxmlformats.org/drawingml/2006/main" xmlns:pic="http://schemas.openxmlformats.org/drawingml/2006/picture">
+            <wp:extent cx="6645600" cy="3201684"/>
+            <wp:docPr id="8" name="Picture 8"/>
+            <wp:cNvGraphicFramePr>
+              <a:graphicFrameLocks noChangeAspect="1"/>
+            </wp:cNvGraphicFramePr>
+            <a:graphic>
+              <a:graphicData uri="http://schemas.openxmlformats.org/drawingml/2006/picture">
+                <pic:pic>
+                  <pic:nvPicPr>
+                    <pic:cNvPr id="0" name="05_airflow_trigger.png"/>
+                    <pic:cNvPicPr/>
+                  </pic:nvPicPr>
+                  <pic:blipFill>
+                    <a:blip r:embed="rId57"/>
+                    <a:stretch>
+                      <a:fillRect/>
+                    </a:stretch>
+                  </pic:blipFill>
+                  <pic:spPr>
+                    <a:xfrm>
+                      <a:off x="0" y="0"/>
+                      <a:ext cx="6645600" cy="3201684"/>
+                    </a:xfrm>
+                    <a:prstGeom prst="rect"/>
+                    <a:ln w="9525">
+                      <a:solidFill>
+                        <a:srgbClr val="B1B9BE"/>
+                      </a:solidFill>
+                    </a:ln>
+                  </pic:spPr>
+                </pic:pic>
+              </a:graphicData>
+            </a:graphic>
+          </wp:inline>
+        </w:drawing>
+      </w:r>
+    </w:p>
     <w:p>
       <w:pPr>
         <w:pStyle w:val="Caption-Figure"/>
@@ -5396,7 +5400,7 @@
         <w:t xml:space="preserve">Figure 8. </w:t>
       </w:r>
       <w:r>
-        <w:t>The trigger form. The student number is the only input.</w:t>
+        <w:t>The trigger form. Enter your student number in the Student number field and click Trigger.</w:t>
       </w:r>
     </w:p>
     <w:p>
@@ -5423,7 +5427,7 @@
     </w:p>
     <w:p>
       <w:r>
-        <w:t xml:space="preserve">Open the DAG, choose the </w:t>
+        <w:t xml:space="preserve">Click the DAG name to open it. The </w:t>
       </w:r>
       <w:r>
         <w:rPr>
@@ -5432,7 +5436,7 @@
         <w:t>Grid</w:t>
       </w:r>
       <w:r>
-        <w:t xml:space="preserve"> view, click the </w:t>
+        <w:t xml:space="preserve"> view shows one column per run, newest on the right. Click the newest bar to see the run details: the Status reads success when it is done, and the run duration is about two and a half minutes. Click the </w:t>
       </w:r>
       <w:r>
         <w:rPr>
@@ -5441,7 +5445,7 @@
         <w:t>curate</w:t>
       </w:r>
       <w:r>
-        <w:t xml:space="preserve"> square in the newest column and open the </w:t>
+        <w:t xml:space="preserve"> square below the bar and open the </w:t>
       </w:r>
       <w:r>
         <w:rPr>
@@ -5450,7 +5454,7 @@
         <w:t>Logs</w:t>
       </w:r>
       <w:r>
-        <w:t xml:space="preserve"> tab. The log shows the SparkApplication being submitted, its state changing about every ten seconds, and ends with the driver log's own summary.</w:t>
+        <w:t xml:space="preserve"> tab to read the task log, which shows the SparkApplication being submitted, its state changing about every ten seconds, and ends with the driver log's own summary.</w:t>
       </w:r>
     </w:p>
     <w:p>
@@ -5640,46 +5644,50 @@
         <w:spacing w:after="40"/>
       </w:pPr>
     </w:p>
-    <w:tbl>
-      <w:tblPr>
-        <w:tblW w:type="auto" w:w="0"/>
+    <w:p>
+      <w:pPr>
         <w:jc w:val="left"/>
-        <w:tblBorders>
-          <w:top w:val="single" w:sz="4" w:space="0" w:color="B1B9BE"/>
-          <w:left w:val="single" w:sz="4" w:space="0" w:color="B1B9BE"/>
-          <w:bottom w:val="single" w:sz="4" w:space="0" w:color="B1B9BE"/>
-          <w:right w:val="single" w:sz="4" w:space="0" w:color="B1B9BE"/>
-          <w:insideH w:val="single" w:sz="4" w:space="0" w:color="B1B9BE"/>
-          <w:insideV w:val="single" w:sz="4" w:space="0" w:color="B1B9BE"/>
-        </w:tblBorders>
-        <w:tblLook w:firstColumn="1" w:firstRow="1" w:lastColumn="0" w:lastRow="0" w:noHBand="0" w:noVBand="1" w:val="04A0"/>
-      </w:tblPr>
-      <w:tblGrid>
-        <w:gridCol w:w="10466"/>
-      </w:tblGrid>
-      <w:tr>
-        <w:tc>
-          <w:tcPr>
-            <w:tcW w:type="dxa" w:w="10466"/>
-            <w:shd w:val="clear" w:color="auto" w:fill="F2F4F5"/>
-          </w:tcPr>
-          <w:p>
-            <w:pPr>
-              <w:spacing w:before="1200" w:after="1200"/>
-              <w:jc w:val="center"/>
-            </w:pPr>
-            <w:r>
-              <w:rPr>
-                <w:i/>
-                <w:color w:val="595959"/>
-                <w:sz w:val="18"/>
-              </w:rPr>
-              <w:t>Screenshot to be inserted: 06_airflow_grid.png</w:t>
-            </w:r>
-          </w:p>
-        </w:tc>
-      </w:tr>
-    </w:tbl>
+      </w:pPr>
+      <w:r>
+        <w:drawing>
+          <wp:inline xmlns:a="http://schemas.openxmlformats.org/drawingml/2006/main" xmlns:pic="http://schemas.openxmlformats.org/drawingml/2006/picture">
+            <wp:extent cx="6645600" cy="3158133"/>
+            <wp:docPr id="9" name="Picture 9"/>
+            <wp:cNvGraphicFramePr>
+              <a:graphicFrameLocks noChangeAspect="1"/>
+            </wp:cNvGraphicFramePr>
+            <a:graphic>
+              <a:graphicData uri="http://schemas.openxmlformats.org/drawingml/2006/picture">
+                <pic:pic>
+                  <pic:nvPicPr>
+                    <pic:cNvPr id="0" name="06_airflow_grid.png"/>
+                    <pic:cNvPicPr/>
+                  </pic:nvPicPr>
+                  <pic:blipFill>
+                    <a:blip r:embed="rId58"/>
+                    <a:stretch>
+                      <a:fillRect/>
+                    </a:stretch>
+                  </pic:blipFill>
+                  <pic:spPr>
+                    <a:xfrm>
+                      <a:off x="0" y="0"/>
+                      <a:ext cx="6645600" cy="3158133"/>
+                    </a:xfrm>
+                    <a:prstGeom prst="rect"/>
+                    <a:ln w="9525">
+                      <a:solidFill>
+                        <a:srgbClr val="B1B9BE"/>
+                      </a:solidFill>
+                    </a:ln>
+                  </pic:spPr>
+                </pic:pic>
+              </a:graphicData>
+            </a:graphic>
+          </wp:inline>
+        </w:drawing>
+      </w:r>
+    </w:p>
     <w:p>
       <w:pPr>
         <w:pStyle w:val="Caption-Figure"/>
@@ -5691,7 +5699,7 @@
         <w:t xml:space="preserve">Figure 9. </w:t>
       </w:r>
       <w:r>
-        <w:t>The Grid view after a successful run, with the curate task log.</w:t>
+        <w:t>The Grid view after a successful run. The newest run is selected and its status is success.</w:t>
       </w:r>
     </w:p>
     <w:p>
@@ -5725,7 +5733,7 @@
         <w:drawing>
           <wp:inline xmlns:a="http://schemas.openxmlformats.org/drawingml/2006/main" xmlns:pic="http://schemas.openxmlformats.org/drawingml/2006/picture">
             <wp:extent cx="6645600" cy="3171359"/>
-            <wp:docPr id="8" name="Picture 8"/>
+            <wp:docPr id="10" name="Picture 10"/>
             <wp:cNvGraphicFramePr>
               <a:graphicFrameLocks noChangeAspect="1"/>
             </wp:cNvGraphicFramePr>
@@ -5737,7 +5745,7 @@
                     <pic:cNvPicPr/>
                   </pic:nvPicPr>
                   <pic:blipFill>
-                    <a:blip r:embed="rId57"/>
+                    <a:blip r:embed="rId59"/>
                     <a:stretch>
                       <a:fillRect/>
                     </a:stretch>
@@ -5796,8 +5804,8 @@
       <w:r>
         <w:drawing>
           <wp:inline xmlns:a="http://schemas.openxmlformats.org/drawingml/2006/main" xmlns:pic="http://schemas.openxmlformats.org/drawingml/2006/picture">
-            <wp:extent cx="6645600" cy="3146981"/>
-            <wp:docPr id="9" name="Picture 9"/>
+            <wp:extent cx="6645600" cy="3199088"/>
+            <wp:docPr id="11" name="Picture 11"/>
             <wp:cNvGraphicFramePr>
               <a:graphicFrameLocks noChangeAspect="1"/>
             </wp:cNvGraphicFramePr>
@@ -5809,7 +5817,7 @@
                     <pic:cNvPicPr/>
                   </pic:nvPicPr>
                   <pic:blipFill>
-                    <a:blip r:embed="rId58"/>
+                    <a:blip r:embed="rId60"/>
                     <a:stretch>
                       <a:fillRect/>
                     </a:stretch>
@@ -5817,7 +5825,7 @@
                   <pic:spPr>
                     <a:xfrm>
                       <a:off x="0" y="0"/>
-                      <a:ext cx="6645600" cy="3146981"/>
+                      <a:ext cx="6645600" cy="3199088"/>
                     </a:xfrm>
                     <a:prstGeom prst="rect"/>
                     <a:ln w="9525">
@@ -5844,7 +5852,7 @@
         <w:t xml:space="preserve">Figure 11. </w:t>
       </w:r>
       <w:r>
-        <w:t>The Spark Applications list. Each participant finds the row carrying their own student number.</w:t>
+        <w:t>The Spark Applications list. The application Airflow created for one participant, curate-student-04, is Completed after 1 minute 49 seconds.</w:t>
       </w:r>
     </w:p>
     <w:p>
@@ -5895,7 +5903,7 @@
         <w:drawing>
           <wp:inline xmlns:a="http://schemas.openxmlformats.org/drawingml/2006/main" xmlns:pic="http://schemas.openxmlformats.org/drawingml/2006/picture">
             <wp:extent cx="6645600" cy="3111223"/>
-            <wp:docPr id="10" name="Picture 10"/>
+            <wp:docPr id="12" name="Picture 12"/>
             <wp:cNvGraphicFramePr>
               <a:graphicFrameLocks noChangeAspect="1"/>
             </wp:cNvGraphicFramePr>
@@ -5907,7 +5915,7 @@
                     <pic:cNvPicPr/>
                   </pic:nvPicPr>
                   <pic:blipFill>
-                    <a:blip r:embed="rId59"/>
+                    <a:blip r:embed="rId61"/>
                     <a:stretch>
                       <a:fillRect/>
                     </a:stretch>
@@ -6481,7 +6489,7 @@
         <w:drawing>
           <wp:inline xmlns:a="http://schemas.openxmlformats.org/drawingml/2006/main" xmlns:pic="http://schemas.openxmlformats.org/drawingml/2006/picture">
             <wp:extent cx="6645600" cy="3087573"/>
-            <wp:docPr id="11" name="Picture 11"/>
+            <wp:docPr id="13" name="Picture 13"/>
             <wp:cNvGraphicFramePr>
               <a:graphicFrameLocks noChangeAspect="1"/>
             </wp:cNvGraphicFramePr>
@@ -6493,7 +6501,7 @@
                     <pic:cNvPicPr/>
                   </pic:nvPicPr>
                   <pic:blipFill>
-                    <a:blip r:embed="rId60"/>
+                    <a:blip r:embed="rId62"/>
                     <a:stretch>
                       <a:fillRect/>
                     </a:stretch>
@@ -6579,7 +6587,7 @@
         <w:drawing>
           <wp:inline xmlns:a="http://schemas.openxmlformats.org/drawingml/2006/main" xmlns:pic="http://schemas.openxmlformats.org/drawingml/2006/picture">
             <wp:extent cx="6645600" cy="3147550"/>
-            <wp:docPr id="12" name="Picture 12"/>
+            <wp:docPr id="14" name="Picture 14"/>
             <wp:cNvGraphicFramePr>
               <a:graphicFrameLocks noChangeAspect="1"/>
             </wp:cNvGraphicFramePr>
@@ -6591,7 +6599,7 @@
                     <pic:cNvPicPr/>
                   </pic:nvPicPr>
                   <pic:blipFill>
-                    <a:blip r:embed="rId61"/>
+                    <a:blip r:embed="rId63"/>
                     <a:stretch>
                       <a:fillRect/>
                     </a:stretch>
@@ -6637,7 +6645,7 @@
         <w:drawing>
           <wp:inline xmlns:a="http://schemas.openxmlformats.org/drawingml/2006/main" xmlns:pic="http://schemas.openxmlformats.org/drawingml/2006/picture">
             <wp:extent cx="6645600" cy="3140610"/>
-            <wp:docPr id="13" name="Picture 13"/>
+            <wp:docPr id="15" name="Picture 15"/>
             <wp:cNvGraphicFramePr>
               <a:graphicFrameLocks noChangeAspect="1"/>
             </wp:cNvGraphicFramePr>
@@ -6649,7 +6657,7 @@
                     <pic:cNvPicPr/>
                   </pic:nvPicPr>
                   <pic:blipFill>
-                    <a:blip r:embed="rId62"/>
+                    <a:blip r:embed="rId64"/>
                     <a:stretch>
                       <a:fillRect/>
                     </a:stretch>
@@ -6727,7 +6735,7 @@
         <w:drawing>
           <wp:inline xmlns:a="http://schemas.openxmlformats.org/drawingml/2006/main" xmlns:pic="http://schemas.openxmlformats.org/drawingml/2006/picture">
             <wp:extent cx="6645600" cy="3187246"/>
-            <wp:docPr id="14" name="Picture 14"/>
+            <wp:docPr id="16" name="Picture 16"/>
             <wp:cNvGraphicFramePr>
               <a:graphicFrameLocks noChangeAspect="1"/>
             </wp:cNvGraphicFramePr>
@@ -6739,7 +6747,7 @@
                     <pic:cNvPicPr/>
                   </pic:nvPicPr>
                   <pic:blipFill>
-                    <a:blip r:embed="rId63"/>
+                    <a:blip r:embed="rId65"/>
                     <a:stretch>
                       <a:fillRect/>
                     </a:stretch>
@@ -8772,7 +8780,7 @@
         <w:drawing>
           <wp:inline xmlns:a="http://schemas.openxmlformats.org/drawingml/2006/main" xmlns:pic="http://schemas.openxmlformats.org/drawingml/2006/picture">
             <wp:extent cx="6645600" cy="4497691"/>
-            <wp:docPr id="15" name="Picture 15"/>
+            <wp:docPr id="17" name="Picture 17"/>
             <wp:cNvGraphicFramePr>
               <a:graphicFrameLocks noChangeAspect="1"/>
             </wp:cNvGraphicFramePr>
@@ -8784,7 +8792,7 @@
                     <pic:cNvPicPr/>
                   </pic:nvPicPr>
                   <pic:blipFill>
-                    <a:blip r:embed="rId64"/>
+                    <a:blip r:embed="rId66"/>
                     <a:stretch>
                       <a:fillRect/>
                     </a:stretch>
@@ -9794,7 +9802,7 @@
         <w:drawing>
           <wp:inline xmlns:a="http://schemas.openxmlformats.org/drawingml/2006/main" xmlns:pic="http://schemas.openxmlformats.org/drawingml/2006/picture">
             <wp:extent cx="6645600" cy="1850031"/>
-            <wp:docPr id="16" name="Picture 16"/>
+            <wp:docPr id="18" name="Picture 18"/>
             <wp:cNvGraphicFramePr>
               <a:graphicFrameLocks noChangeAspect="1"/>
             </wp:cNvGraphicFramePr>
@@ -9806,7 +9814,7 @@
                     <pic:cNvPicPr/>
                   </pic:nvPicPr>
                   <pic:blipFill>
-                    <a:blip r:embed="rId65"/>
+                    <a:blip r:embed="rId67"/>
                     <a:stretch>
                       <a:fillRect/>
                     </a:stretch>
@@ -10664,105 +10672,105 @@
           <w:rFonts w:ascii="Consolas" w:hAnsi="Consolas"/>
           <w:sz w:val="17"/>
         </w:rPr>
-        <w:t>distinct_titles_30d       0.387297</w:t>
-      </w:r>
-    </w:p>
-    <w:p>
-      <w:pPr>
-        <w:shd w:val="clear" w:color="auto" w:fill="F2F4F5"/>
-        <w:spacing w:after="0" w:before="0"/>
-        <w:ind w:left="227"/>
-      </w:pPr>
-      <w:r>
-        <w:rPr>
-          <w:rFonts w:ascii="Consolas" w:hAnsi="Consolas"/>
-          <w:sz w:val="17"/>
-        </w:rPr>
-        <w:t>sessions_30d              0.339300</w:t>
-      </w:r>
-    </w:p>
-    <w:p>
-      <w:pPr>
-        <w:shd w:val="clear" w:color="auto" w:fill="F2F4F5"/>
-        <w:spacing w:after="0" w:before="0"/>
-        <w:ind w:left="227"/>
-      </w:pPr>
-      <w:r>
-        <w:rPr>
-          <w:rFonts w:ascii="Consolas" w:hAnsi="Consolas"/>
-          <w:sz w:val="17"/>
-        </w:rPr>
-        <w:t>support_tickets_90d       0.046647</w:t>
-      </w:r>
-    </w:p>
-    <w:p>
-      <w:pPr>
-        <w:shd w:val="clear" w:color="auto" w:fill="F2F4F5"/>
-        <w:spacing w:after="0" w:before="0"/>
-        <w:ind w:left="227"/>
-      </w:pPr>
-      <w:r>
-        <w:rPr>
-          <w:rFonts w:ascii="Consolas" w:hAnsi="Consolas"/>
-          <w:sz w:val="17"/>
-        </w:rPr>
-        <w:t>payment_method_prepaid    0.029106</w:t>
-      </w:r>
-    </w:p>
-    <w:p>
-      <w:pPr>
-        <w:shd w:val="clear" w:color="auto" w:fill="F2F4F5"/>
-        <w:spacing w:after="0" w:before="0"/>
-        <w:ind w:left="227"/>
-      </w:pPr>
-      <w:r>
-        <w:rPr>
-          <w:rFonts w:ascii="Consolas" w:hAnsi="Consolas"/>
-          <w:sz w:val="17"/>
-        </w:rPr>
-        <w:t>monthly_price             0.028554</w:t>
-      </w:r>
-    </w:p>
-    <w:p>
-      <w:pPr>
-        <w:shd w:val="clear" w:color="auto" w:fill="F2F4F5"/>
-        <w:spacing w:after="0" w:before="0"/>
-        <w:ind w:left="227"/>
-      </w:pPr>
-      <w:r>
-        <w:rPr>
-          <w:rFonts w:ascii="Consolas" w:hAnsi="Consolas"/>
-          <w:sz w:val="17"/>
-        </w:rPr>
-        <w:t>tenure_months             0.021727</w:t>
-      </w:r>
-    </w:p>
-    <w:p>
-      <w:pPr>
-        <w:shd w:val="clear" w:color="auto" w:fill="F2F4F5"/>
-        <w:spacing w:after="0" w:before="0"/>
-        <w:ind w:left="227"/>
-      </w:pPr>
-      <w:r>
-        <w:rPr>
-          <w:rFonts w:ascii="Consolas" w:hAnsi="Consolas"/>
-          <w:sz w:val="17"/>
-        </w:rPr>
-        <w:t>country_BR                0.014328</w:t>
-      </w:r>
-    </w:p>
-    <w:p>
-      <w:pPr>
-        <w:shd w:val="clear" w:color="auto" w:fill="F2F4F5"/>
-        <w:spacing w:after="0" w:before="0"/>
-        <w:ind w:left="227"/>
-      </w:pPr>
-      <w:r>
-        <w:rPr>
-          <w:rFonts w:ascii="Consolas" w:hAnsi="Consolas"/>
-          <w:sz w:val="17"/>
-        </w:rPr>
-        <w:t>minutes_30d               0.014240</w:t>
+        <w:t>sessions_30d              0.432158</w:t>
+      </w:r>
+    </w:p>
+    <w:p>
+      <w:pPr>
+        <w:shd w:val="clear" w:color="auto" w:fill="F2F4F5"/>
+        <w:spacing w:after="0" w:before="0"/>
+        <w:ind w:left="227"/>
+      </w:pPr>
+      <w:r>
+        <w:rPr>
+          <w:rFonts w:ascii="Consolas" w:hAnsi="Consolas"/>
+          <w:sz w:val="17"/>
+        </w:rPr>
+        <w:t>distinct_titles_30d       0.284886</w:t>
+      </w:r>
+    </w:p>
+    <w:p>
+      <w:pPr>
+        <w:shd w:val="clear" w:color="auto" w:fill="F2F4F5"/>
+        <w:spacing w:after="0" w:before="0"/>
+        <w:ind w:left="227"/>
+      </w:pPr>
+      <w:r>
+        <w:rPr>
+          <w:rFonts w:ascii="Consolas" w:hAnsi="Consolas"/>
+          <w:sz w:val="17"/>
+        </w:rPr>
+        <w:t>support_tickets_90d       0.047247</w:t>
+      </w:r>
+    </w:p>
+    <w:p>
+      <w:pPr>
+        <w:shd w:val="clear" w:color="auto" w:fill="F2F4F5"/>
+        <w:spacing w:after="0" w:before="0"/>
+        <w:ind w:left="227"/>
+      </w:pPr>
+      <w:r>
+        <w:rPr>
+          <w:rFonts w:ascii="Consolas" w:hAnsi="Consolas"/>
+          <w:sz w:val="17"/>
+        </w:rPr>
+        <w:t>monthly_price             0.028597</w:t>
+      </w:r>
+    </w:p>
+    <w:p>
+      <w:pPr>
+        <w:shd w:val="clear" w:color="auto" w:fill="F2F4F5"/>
+        <w:spacing w:after="0" w:before="0"/>
+        <w:ind w:left="227"/>
+      </w:pPr>
+      <w:r>
+        <w:rPr>
+          <w:rFonts w:ascii="Consolas" w:hAnsi="Consolas"/>
+          <w:sz w:val="17"/>
+        </w:rPr>
+        <w:t>payment_method_prepaid    0.027612</w:t>
+      </w:r>
+    </w:p>
+    <w:p>
+      <w:pPr>
+        <w:shd w:val="clear" w:color="auto" w:fill="F2F4F5"/>
+        <w:spacing w:after="0" w:before="0"/>
+        <w:ind w:left="227"/>
+      </w:pPr>
+      <w:r>
+        <w:rPr>
+          <w:rFonts w:ascii="Consolas" w:hAnsi="Consolas"/>
+          <w:sz w:val="17"/>
+        </w:rPr>
+        <w:t>tenure_months             0.022455</w:t>
+      </w:r>
+    </w:p>
+    <w:p>
+      <w:pPr>
+        <w:shd w:val="clear" w:color="auto" w:fill="F2F4F5"/>
+        <w:spacing w:after="0" w:before="0"/>
+        <w:ind w:left="227"/>
+      </w:pPr>
+      <w:r>
+        <w:rPr>
+          <w:rFonts w:ascii="Consolas" w:hAnsi="Consolas"/>
+          <w:sz w:val="17"/>
+        </w:rPr>
+        <w:t>minutes_30d               0.014820</w:t>
+      </w:r>
+    </w:p>
+    <w:p>
+      <w:pPr>
+        <w:shd w:val="clear" w:color="auto" w:fill="F2F4F5"/>
+        <w:spacing w:after="0" w:before="0"/>
+        <w:ind w:left="227"/>
+      </w:pPr>
+      <w:r>
+        <w:rPr>
+          <w:rFonts w:ascii="Consolas" w:hAnsi="Consolas"/>
+          <w:sz w:val="17"/>
+        </w:rPr>
+        <w:t>country_GB                0.014662</w:t>
       </w:r>
     </w:p>
     <w:p>
@@ -10804,77 +10812,77 @@
           <w:rFonts w:ascii="Consolas" w:hAnsi="Consolas"/>
           <w:sz w:val="17"/>
         </w:rPr>
-        <w:t>country_BR    0.014328</w:t>
-      </w:r>
-    </w:p>
-    <w:p>
-      <w:pPr>
-        <w:shd w:val="clear" w:color="auto" w:fill="F2F4F5"/>
-        <w:spacing w:after="0" w:before="0"/>
-        <w:ind w:left="227"/>
-      </w:pPr>
-      <w:r>
-        <w:rPr>
-          <w:rFonts w:ascii="Consolas" w:hAnsi="Consolas"/>
-          <w:sz w:val="17"/>
-        </w:rPr>
-        <w:t>country_DE    0.013573</w:t>
-      </w:r>
-    </w:p>
-    <w:p>
-      <w:pPr>
-        <w:shd w:val="clear" w:color="auto" w:fill="F2F4F5"/>
-        <w:spacing w:after="0" w:before="0"/>
-        <w:ind w:left="227"/>
-      </w:pPr>
-      <w:r>
-        <w:rPr>
-          <w:rFonts w:ascii="Consolas" w:hAnsi="Consolas"/>
-          <w:sz w:val="17"/>
-        </w:rPr>
-        <w:t>country_GB    0.013206</w:t>
-      </w:r>
-    </w:p>
-    <w:p>
-      <w:pPr>
-        <w:shd w:val="clear" w:color="auto" w:fill="F2F4F5"/>
-        <w:spacing w:after="0" w:before="0"/>
-        <w:ind w:left="227"/>
-      </w:pPr>
-      <w:r>
-        <w:rPr>
-          <w:rFonts w:ascii="Consolas" w:hAnsi="Consolas"/>
-          <w:sz w:val="17"/>
-        </w:rPr>
-        <w:t>country_US    0.012810</w:t>
-      </w:r>
-    </w:p>
-    <w:p>
-      <w:pPr>
-        <w:shd w:val="clear" w:color="auto" w:fill="F2F4F5"/>
-        <w:spacing w:after="0" w:before="0"/>
-        <w:ind w:left="227"/>
-      </w:pPr>
-      <w:r>
-        <w:rPr>
-          <w:rFonts w:ascii="Consolas" w:hAnsi="Consolas"/>
-          <w:sz w:val="17"/>
-        </w:rPr>
-        <w:t>country_IN    0.012603</w:t>
-      </w:r>
-    </w:p>
-    <w:p>
-      <w:pPr>
-        <w:shd w:val="clear" w:color="auto" w:fill="F2F4F5"/>
-        <w:spacing w:after="0" w:before="0"/>
-        <w:ind w:left="227"/>
-      </w:pPr>
-      <w:r>
-        <w:rPr>
-          <w:rFonts w:ascii="Consolas" w:hAnsi="Consolas"/>
-          <w:sz w:val="17"/>
-        </w:rPr>
-        <w:t>country_JP    0.012573</w:t>
+        <w:t>country_GB    0.014662</w:t>
+      </w:r>
+    </w:p>
+    <w:p>
+      <w:pPr>
+        <w:shd w:val="clear" w:color="auto" w:fill="F2F4F5"/>
+        <w:spacing w:after="0" w:before="0"/>
+        <w:ind w:left="227"/>
+      </w:pPr>
+      <w:r>
+        <w:rPr>
+          <w:rFonts w:ascii="Consolas" w:hAnsi="Consolas"/>
+          <w:sz w:val="17"/>
+        </w:rPr>
+        <w:t>country_JP    0.014520</w:t>
+      </w:r>
+    </w:p>
+    <w:p>
+      <w:pPr>
+        <w:shd w:val="clear" w:color="auto" w:fill="F2F4F5"/>
+        <w:spacing w:after="0" w:before="0"/>
+        <w:ind w:left="227"/>
+      </w:pPr>
+      <w:r>
+        <w:rPr>
+          <w:rFonts w:ascii="Consolas" w:hAnsi="Consolas"/>
+          <w:sz w:val="17"/>
+        </w:rPr>
+        <w:t>country_BR    0.014121</w:t>
+      </w:r>
+    </w:p>
+    <w:p>
+      <w:pPr>
+        <w:shd w:val="clear" w:color="auto" w:fill="F2F4F5"/>
+        <w:spacing w:after="0" w:before="0"/>
+        <w:ind w:left="227"/>
+      </w:pPr>
+      <w:r>
+        <w:rPr>
+          <w:rFonts w:ascii="Consolas" w:hAnsi="Consolas"/>
+          <w:sz w:val="17"/>
+        </w:rPr>
+        <w:t>country_DE    0.013542</w:t>
+      </w:r>
+    </w:p>
+    <w:p>
+      <w:pPr>
+        <w:shd w:val="clear" w:color="auto" w:fill="F2F4F5"/>
+        <w:spacing w:after="0" w:before="0"/>
+        <w:ind w:left="227"/>
+      </w:pPr>
+      <w:r>
+        <w:rPr>
+          <w:rFonts w:ascii="Consolas" w:hAnsi="Consolas"/>
+          <w:sz w:val="17"/>
+        </w:rPr>
+        <w:t>country_IN    0.013540</w:t>
+      </w:r>
+    </w:p>
+    <w:p>
+      <w:pPr>
+        <w:shd w:val="clear" w:color="auto" w:fill="F2F4F5"/>
+        <w:spacing w:after="0" w:before="0"/>
+        <w:ind w:left="227"/>
+      </w:pPr>
+      <w:r>
+        <w:rPr>
+          <w:rFonts w:ascii="Consolas" w:hAnsi="Consolas"/>
+          <w:sz w:val="17"/>
+        </w:rPr>
+        <w:t>country_US    0.012586</w:t>
       </w:r>
     </w:p>
     <w:p>
@@ -10902,21 +10910,35 @@
           <w:rFonts w:ascii="Consolas" w:hAnsi="Consolas"/>
           <w:sz w:val="17"/>
         </w:rPr>
-        <w:t xml:space="preserve">  noise columns : spread 0.0018  (from 0.0126 to 0.0143)</w:t>
-      </w:r>
-    </w:p>
-    <w:p>
-      <w:pPr>
-        <w:shd w:val="clear" w:color="auto" w:fill="F2F4F5"/>
-        <w:spacing w:after="0" w:before="0"/>
-        <w:ind w:left="227"/>
-      </w:pPr>
-      <w:r>
-        <w:rPr>
-          <w:rFonts w:ascii="Consolas" w:hAnsi="Consolas"/>
-          <w:sz w:val="17"/>
-        </w:rPr>
-        <w:t xml:space="preserve">  real  columns : spread 0.3873  (from 0.0000 to 0.3873)</w:t>
+        <w:t xml:space="preserve">  noise columns : spread 0.0021  (from 0.0126 to 0.0147)</w:t>
+      </w:r>
+    </w:p>
+    <w:p>
+      <w:pPr>
+        <w:shd w:val="clear" w:color="auto" w:fill="F2F4F5"/>
+        <w:spacing w:after="0" w:before="0"/>
+        <w:ind w:left="227"/>
+      </w:pPr>
+      <w:r>
+        <w:rPr>
+          <w:rFonts w:ascii="Consolas" w:hAnsi="Consolas"/>
+          <w:sz w:val="17"/>
+        </w:rPr>
+        <w:t xml:space="preserve">  real  columns : spread 0.4322  (from 0.0000 to 0.4322)</w:t>
+      </w:r>
+    </w:p>
+    <w:p>
+      <w:pPr>
+        <w:shd w:val="clear" w:color="auto" w:fill="F2F4F5"/>
+        <w:spacing w:after="0" w:before="0"/>
+        <w:ind w:left="227"/>
+      </w:pPr>
+      <w:r>
+        <w:rPr>
+          <w:rFonts w:ascii="Consolas" w:hAnsi="Consolas"/>
+          <w:sz w:val="17"/>
+        </w:rPr>
+        <w:t>Real features disagree with each other. Noise features do not.</w:t>
       </w:r>
     </w:p>
     <w:p>
@@ -10924,46 +10946,50 @@
         <w:spacing w:after="40"/>
       </w:pPr>
     </w:p>
-    <w:tbl>
-      <w:tblPr>
-        <w:tblW w:type="auto" w:w="0"/>
+    <w:p>
+      <w:pPr>
         <w:jc w:val="left"/>
-        <w:tblBorders>
-          <w:top w:val="single" w:sz="4" w:space="0" w:color="B1B9BE"/>
-          <w:left w:val="single" w:sz="4" w:space="0" w:color="B1B9BE"/>
-          <w:bottom w:val="single" w:sz="4" w:space="0" w:color="B1B9BE"/>
-          <w:right w:val="single" w:sz="4" w:space="0" w:color="B1B9BE"/>
-          <w:insideH w:val="single" w:sz="4" w:space="0" w:color="B1B9BE"/>
-          <w:insideV w:val="single" w:sz="4" w:space="0" w:color="B1B9BE"/>
-        </w:tblBorders>
-        <w:tblLook w:firstColumn="1" w:firstRow="1" w:lastColumn="0" w:lastRow="0" w:noHBand="0" w:noVBand="1" w:val="04A0"/>
-      </w:tblPr>
-      <w:tblGrid>
-        <w:gridCol w:w="10466"/>
-      </w:tblGrid>
-      <w:tr>
-        <w:tc>
-          <w:tcPr>
-            <w:tcW w:type="dxa" w:w="10466"/>
-            <w:shd w:val="clear" w:color="auto" w:fill="F2F4F5"/>
-          </w:tcPr>
-          <w:p>
-            <w:pPr>
-              <w:spacing w:before="1200" w:after="1200"/>
-              <w:jc w:val="center"/>
-            </w:pPr>
-            <w:r>
-              <w:rPr>
-                <w:i/>
-                <w:color w:val="595959"/>
-                <w:sz w:val="18"/>
-              </w:rPr>
-              <w:t>Screenshot to be inserted: 12_part7.png</w:t>
-            </w:r>
-          </w:p>
-        </w:tc>
-      </w:tr>
-    </w:tbl>
+      </w:pPr>
+      <w:r>
+        <w:drawing>
+          <wp:inline xmlns:a="http://schemas.openxmlformats.org/drawingml/2006/main" xmlns:pic="http://schemas.openxmlformats.org/drawingml/2006/picture">
+            <wp:extent cx="6645600" cy="5174360"/>
+            <wp:docPr id="19" name="Picture 19"/>
+            <wp:cNvGraphicFramePr>
+              <a:graphicFrameLocks noChangeAspect="1"/>
+            </wp:cNvGraphicFramePr>
+            <a:graphic>
+              <a:graphicData uri="http://schemas.openxmlformats.org/drawingml/2006/picture">
+                <pic:pic>
+                  <pic:nvPicPr>
+                    <pic:cNvPr id="0" name="12_part7.png"/>
+                    <pic:cNvPicPr/>
+                  </pic:nvPicPr>
+                  <pic:blipFill>
+                    <a:blip r:embed="rId68"/>
+                    <a:stretch>
+                      <a:fillRect/>
+                    </a:stretch>
+                  </pic:blipFill>
+                  <pic:spPr>
+                    <a:xfrm>
+                      <a:off x="0" y="0"/>
+                      <a:ext cx="6645600" cy="5174360"/>
+                    </a:xfrm>
+                    <a:prstGeom prst="rect"/>
+                    <a:ln w="9525">
+                      <a:solidFill>
+                        <a:srgbClr val="B1B9BE"/>
+                      </a:solidFill>
+                    </a:ln>
+                  </pic:spPr>
+                </pic:pic>
+              </a:graphicData>
+            </a:graphic>
+          </wp:inline>
+        </w:drawing>
+      </w:r>
+    </w:p>
     <w:p>
       <w:pPr>
         <w:pStyle w:val="Caption-Figure"/>
@@ -10975,7 +11001,12 @@
         <w:t xml:space="preserve">Figure 20. </w:t>
       </w:r>
       <w:r>
-        <w:t>Parts 6 and 7. The held-out AUC and the feature importance with the noise fingerprint.</w:t>
+        <w:t>Part 7 output. The feature importance with the noise fingerprint: six country columns within 0.002 of each other.</w:t>
+      </w:r>
+    </w:p>
+    <w:p>
+      <w:r>
+        <w:t>The exact values vary slightly from run to run because the two engagement features share the credit differently each time, but the shape does not: two engagement features at the top, tickets and plan next, and the six countries bunched together at the bottom.</w:t>
       </w:r>
     </w:p>
     <w:p>
@@ -11340,7 +11371,7 @@
         <w:drawing>
           <wp:inline xmlns:a="http://schemas.openxmlformats.org/drawingml/2006/main" xmlns:pic="http://schemas.openxmlformats.org/drawingml/2006/picture">
             <wp:extent cx="6645600" cy="1545261"/>
-            <wp:docPr id="17" name="Picture 17"/>
+            <wp:docPr id="20" name="Picture 20"/>
             <wp:cNvGraphicFramePr>
               <a:graphicFrameLocks noChangeAspect="1"/>
             </wp:cNvGraphicFramePr>
@@ -11352,7 +11383,7 @@
                     <pic:cNvPicPr/>
                   </pic:nvPicPr>
                   <pic:blipFill>
-                    <a:blip r:embed="rId66"/>
+                    <a:blip r:embed="rId69"/>
                     <a:stretch>
                       <a:fillRect/>
                     </a:stretch>
@@ -11544,7 +11575,7 @@
         <w:drawing>
           <wp:inline xmlns:a="http://schemas.openxmlformats.org/drawingml/2006/main" xmlns:pic="http://schemas.openxmlformats.org/drawingml/2006/picture">
             <wp:extent cx="6645600" cy="3158165"/>
-            <wp:docPr id="18" name="Picture 18"/>
+            <wp:docPr id="21" name="Picture 21"/>
             <wp:cNvGraphicFramePr>
               <a:graphicFrameLocks noChangeAspect="1"/>
             </wp:cNvGraphicFramePr>
@@ -11556,7 +11587,7 @@
                     <pic:cNvPicPr/>
                   </pic:nvPicPr>
                   <pic:blipFill>
-                    <a:blip r:embed="rId67"/>
+                    <a:blip r:embed="rId70"/>
                     <a:stretch>
                       <a:fillRect/>
                     </a:stretch>
@@ -11602,7 +11633,7 @@
         <w:drawing>
           <wp:inline xmlns:a="http://schemas.openxmlformats.org/drawingml/2006/main" xmlns:pic="http://schemas.openxmlformats.org/drawingml/2006/picture">
             <wp:extent cx="6645600" cy="3159952"/>
-            <wp:docPr id="19" name="Picture 19"/>
+            <wp:docPr id="22" name="Picture 22"/>
             <wp:cNvGraphicFramePr>
               <a:graphicFrameLocks noChangeAspect="1"/>
             </wp:cNvGraphicFramePr>
@@ -11614,7 +11645,7 @@
                     <pic:cNvPicPr/>
                   </pic:nvPicPr>
                   <pic:blipFill>
-                    <a:blip r:embed="rId68"/>
+                    <a:blip r:embed="rId71"/>
                     <a:stretch>
                       <a:fillRect/>
                     </a:stretch>
@@ -11660,7 +11691,7 @@
         <w:drawing>
           <wp:inline xmlns:a="http://schemas.openxmlformats.org/drawingml/2006/main" xmlns:pic="http://schemas.openxmlformats.org/drawingml/2006/picture">
             <wp:extent cx="6645600" cy="3158133"/>
-            <wp:docPr id="20" name="Picture 20"/>
+            <wp:docPr id="23" name="Picture 23"/>
             <wp:cNvGraphicFramePr>
               <a:graphicFrameLocks noChangeAspect="1"/>
             </wp:cNvGraphicFramePr>
@@ -11672,7 +11703,7 @@
                     <pic:cNvPicPr/>
                   </pic:nvPicPr>
                   <pic:blipFill>
-                    <a:blip r:embed="rId69"/>
+                    <a:blip r:embed="rId72"/>
                     <a:stretch>
                       <a:fillRect/>
                     </a:stretch>
@@ -11718,7 +11749,7 @@
         <w:drawing>
           <wp:inline xmlns:a="http://schemas.openxmlformats.org/drawingml/2006/main" xmlns:pic="http://schemas.openxmlformats.org/drawingml/2006/picture">
             <wp:extent cx="6645600" cy="3142627"/>
-            <wp:docPr id="21" name="Picture 21"/>
+            <wp:docPr id="24" name="Picture 24"/>
             <wp:cNvGraphicFramePr>
               <a:graphicFrameLocks noChangeAspect="1"/>
             </wp:cNvGraphicFramePr>
@@ -11730,7 +11761,7 @@
                     <pic:cNvPicPr/>
                   </pic:nvPicPr>
                   <pic:blipFill>
-                    <a:blip r:embed="rId70"/>
+                    <a:blip r:embed="rId73"/>
                     <a:stretch>
                       <a:fillRect/>
                     </a:stretch>
@@ -12600,7 +12631,7 @@
         <w:drawing>
           <wp:inline xmlns:a="http://schemas.openxmlformats.org/drawingml/2006/main" xmlns:pic="http://schemas.openxmlformats.org/drawingml/2006/picture">
             <wp:extent cx="6645600" cy="2200308"/>
-            <wp:docPr id="22" name="Picture 22"/>
+            <wp:docPr id="25" name="Picture 25"/>
             <wp:cNvGraphicFramePr>
               <a:graphicFrameLocks noChangeAspect="1"/>
             </wp:cNvGraphicFramePr>
@@ -12612,7 +12643,7 @@
                     <pic:cNvPicPr/>
                   </pic:nvPicPr>
                   <pic:blipFill>
-                    <a:blip r:embed="rId71"/>
+                    <a:blip r:embed="rId74"/>
                     <a:stretch>
                       <a:fillRect/>
                     </a:stretch>
@@ -13398,7 +13429,7 @@
           <w:rFonts w:ascii="Consolas" w:hAnsi="Consolas"/>
           <w:sz w:val="17"/>
         </w:rPr>
-        <w:t>scikit-learn brute force :   1.85 s   50,000 queries x 150,000 vectors x 19 dims   (4 CPU cores)</w:t>
+        <w:t>scikit-learn brute force :   4.03 s   50,000 queries x 150,000 vectors x 19 dims   (4 CPU cores)</w:t>
       </w:r>
     </w:p>
     <w:p>
@@ -13440,21 +13471,21 @@
           <w:rFonts w:ascii="Consolas" w:hAnsi="Consolas"/>
           <w:sz w:val="17"/>
         </w:rPr>
-        <w:t xml:space="preserve">  recall@10 vs CPU : 0.9997   (same neighbours)</w:t>
-      </w:r>
-    </w:p>
-    <w:p>
-      <w:pPr>
-        <w:shd w:val="clear" w:color="auto" w:fill="F2F4F5"/>
-        <w:spacing w:after="0" w:before="0"/>
-        <w:ind w:left="227"/>
-      </w:pPr>
-      <w:r>
-        <w:rPr>
-          <w:rFonts w:ascii="Consolas" w:hAnsi="Consolas"/>
-          <w:sz w:val="17"/>
-        </w:rPr>
-        <w:t xml:space="preserve">  SPEED-UP        : 37.5x</w:t>
+        <w:t xml:space="preserve">  recall@10 vs CPU : 0.9996   (same neighbours)</w:t>
+      </w:r>
+    </w:p>
+    <w:p>
+      <w:pPr>
+        <w:shd w:val="clear" w:color="auto" w:fill="F2F4F5"/>
+        <w:spacing w:after="0" w:before="0"/>
+        <w:ind w:left="227"/>
+      </w:pPr>
+      <w:r>
+        <w:rPr>
+          <w:rFonts w:ascii="Consolas" w:hAnsi="Consolas"/>
+          <w:sz w:val="17"/>
+        </w:rPr>
+        <w:t xml:space="preserve">  SPEED-UP        : 85.2x</w:t>
       </w:r>
     </w:p>
     <w:p>
@@ -13482,21 +13513,21 @@
           <w:rFonts w:ascii="Consolas" w:hAnsi="Consolas"/>
           <w:sz w:val="17"/>
         </w:rPr>
-        <w:t>look-alike churn score AUC : 0.8143   (no model was trained for this)</w:t>
-      </w:r>
-    </w:p>
-    <w:p>
-      <w:pPr>
-        <w:shd w:val="clear" w:color="auto" w:fill="F2F4F5"/>
-        <w:spacing w:after="0" w:before="0"/>
-        <w:ind w:left="227"/>
-      </w:pPr>
-      <w:r>
-        <w:rPr>
-          <w:rFonts w:ascii="Consolas" w:hAnsi="Consolas"/>
-          <w:sz w:val="17"/>
-        </w:rPr>
-        <w:t>trained XGBoost AUC        : 0.8712</w:t>
+        <w:t>look-alike churn score AUC : 0.8128   (no model was trained for this)</w:t>
+      </w:r>
+    </w:p>
+    <w:p>
+      <w:pPr>
+        <w:shd w:val="clear" w:color="auto" w:fill="F2F4F5"/>
+        <w:spacing w:after="0" w:before="0"/>
+        <w:ind w:left="227"/>
+      </w:pPr>
+      <w:r>
+        <w:rPr>
+          <w:rFonts w:ascii="Consolas" w:hAnsi="Consolas"/>
+          <w:sz w:val="17"/>
+        </w:rPr>
+        <w:t>trained XGBoost AUC        : 0.8682</w:t>
       </w:r>
     </w:p>
     <w:p>
@@ -13504,46 +13535,50 @@
         <w:spacing w:after="40"/>
       </w:pPr>
     </w:p>
-    <w:tbl>
-      <w:tblPr>
-        <w:tblW w:type="auto" w:w="0"/>
+    <w:p>
+      <w:pPr>
         <w:jc w:val="left"/>
-        <w:tblBorders>
-          <w:top w:val="single" w:sz="4" w:space="0" w:color="B1B9BE"/>
-          <w:left w:val="single" w:sz="4" w:space="0" w:color="B1B9BE"/>
-          <w:bottom w:val="single" w:sz="4" w:space="0" w:color="B1B9BE"/>
-          <w:right w:val="single" w:sz="4" w:space="0" w:color="B1B9BE"/>
-          <w:insideH w:val="single" w:sz="4" w:space="0" w:color="B1B9BE"/>
-          <w:insideV w:val="single" w:sz="4" w:space="0" w:color="B1B9BE"/>
-        </w:tblBorders>
-        <w:tblLook w:firstColumn="1" w:firstRow="1" w:lastColumn="0" w:lastRow="0" w:noHBand="0" w:noVBand="1" w:val="04A0"/>
-      </w:tblPr>
-      <w:tblGrid>
-        <w:gridCol w:w="10466"/>
-      </w:tblGrid>
-      <w:tr>
-        <w:tc>
-          <w:tcPr>
-            <w:tcW w:type="dxa" w:w="10466"/>
-            <w:shd w:val="clear" w:color="auto" w:fill="F2F4F5"/>
-          </w:tcPr>
-          <w:p>
-            <w:pPr>
-              <w:spacing w:before="1200" w:after="1200"/>
-              <w:jc w:val="center"/>
-            </w:pPr>
-            <w:r>
-              <w:rPr>
-                <w:i/>
-                <w:color w:val="595959"/>
-                <w:sz w:val="18"/>
-              </w:rPr>
-              <w:t>Screenshot to be inserted: 15_part10.png</w:t>
-            </w:r>
-          </w:p>
-        </w:tc>
-      </w:tr>
-    </w:tbl>
+      </w:pPr>
+      <w:r>
+        <w:drawing>
+          <wp:inline xmlns:a="http://schemas.openxmlformats.org/drawingml/2006/main" xmlns:pic="http://schemas.openxmlformats.org/drawingml/2006/picture">
+            <wp:extent cx="6645600" cy="2184950"/>
+            <wp:docPr id="26" name="Picture 26"/>
+            <wp:cNvGraphicFramePr>
+              <a:graphicFrameLocks noChangeAspect="1"/>
+            </wp:cNvGraphicFramePr>
+            <a:graphic>
+              <a:graphicData uri="http://schemas.openxmlformats.org/drawingml/2006/picture">
+                <pic:pic>
+                  <pic:nvPicPr>
+                    <pic:cNvPr id="0" name="15_part10.png"/>
+                    <pic:cNvPicPr/>
+                  </pic:nvPicPr>
+                  <pic:blipFill>
+                    <a:blip r:embed="rId75"/>
+                    <a:stretch>
+                      <a:fillRect/>
+                    </a:stretch>
+                  </pic:blipFill>
+                  <pic:spPr>
+                    <a:xfrm>
+                      <a:off x="0" y="0"/>
+                      <a:ext cx="6645600" cy="2184950"/>
+                    </a:xfrm>
+                    <a:prstGeom prst="rect"/>
+                    <a:ln w="9525">
+                      <a:solidFill>
+                        <a:srgbClr val="B1B9BE"/>
+                      </a:solidFill>
+                    </a:ln>
+                  </pic:spPr>
+                </pic:pic>
+              </a:graphicData>
+            </a:graphic>
+          </wp:inline>
+        </w:drawing>
+      </w:r>
+    </w:p>
     <w:p>
       <w:pPr>
         <w:pStyle w:val="Caption-Figure"/>
@@ -13555,7 +13590,7 @@
         <w:t xml:space="preserve">Figure 27. </w:t>
       </w:r>
       <w:r>
-        <w:t>Part 10 output. Recall checked, then the measured speed-up and the look-alike score.</w:t>
+        <w:t>Part 10 output on the reference L40S run. The GPU found the same neighbours, 85 times faster than four CPU cores.</w:t>
       </w:r>
     </w:p>
     <w:p>
@@ -13704,21 +13739,21 @@
           <w:rFonts w:ascii="Consolas" w:hAnsi="Consolas"/>
           <w:sz w:val="17"/>
         </w:rPr>
-        <w:t xml:space="preserve">  cuVS look-alike search              CPU 1.85 s  GPU 0.05 s                  37.5x</w:t>
-      </w:r>
-    </w:p>
-    <w:p>
-      <w:pPr>
-        <w:shd w:val="clear" w:color="auto" w:fill="F2F4F5"/>
-        <w:spacing w:after="0" w:before="0"/>
-        <w:ind w:left="227"/>
-      </w:pPr>
-      <w:r>
-        <w:rPr>
-          <w:rFonts w:ascii="Consolas" w:hAnsi="Consolas"/>
-          <w:sz w:val="17"/>
-        </w:rPr>
-        <w:t xml:space="preserve">  Model quality                       XGBoost AUC 0.8712; look-alike AUC 0.8143</w:t>
+        <w:t xml:space="preserve">  cuVS look-alike search              CPU 4.03 s  GPU 0.05 s                  85.2x</w:t>
+      </w:r>
+    </w:p>
+    <w:p>
+      <w:pPr>
+        <w:shd w:val="clear" w:color="auto" w:fill="F2F4F5"/>
+        <w:spacing w:after="0" w:before="0"/>
+        <w:ind w:left="227"/>
+      </w:pPr>
+      <w:r>
+        <w:rPr>
+          <w:rFonts w:ascii="Consolas" w:hAnsi="Consolas"/>
+          <w:sz w:val="17"/>
+        </w:rPr>
+        <w:t xml:space="preserve">  Model quality                       XGBoost AUC 0.8682; look-alike AUC 0.8128</w:t>
       </w:r>
     </w:p>
     <w:p>
@@ -14547,7 +14582,7 @@
               <w:rPr>
                 <w:sz w:val="18"/>
               </w:rPr>
-              <w:t>0.0018, against 0.387 for real features</w:t>
+              <w:t>0.002, against 0.43 for real features</w:t>
             </w:r>
           </w:p>
         </w:tc>
@@ -14647,7 +14682,7 @@
               <w:rPr>
                 <w:sz w:val="18"/>
               </w:rPr>
-              <w:t>Recall at 10 of 0.9997; about 37x against 4 CPU cores on the build machine</w:t>
+              <w:t>Recall at 10 of 0.9996; 4.03 s on 4 CPU cores versus 0.05 s on the L40S, 85x</w:t>
             </w:r>
           </w:p>
         </w:tc>
@@ -14697,7 +14732,7 @@
               <w:rPr>
                 <w:sz w:val="18"/>
               </w:rPr>
-              <w:t>0.814 with no trained model</w:t>
+              <w:t>0.813 with no trained model</w:t>
             </w:r>
           </w:p>
         </w:tc>
@@ -14798,6 +14833,18 @@
       </w:pPr>
       <w:r>
         <w:t>The look-alike score is model-free and reaches 0.81. The trained model reaches 0.87. The difference is what training buys.</w:t>
+      </w:r>
+    </w:p>
+    <w:p>
+      <w:pPr>
+        <w:pStyle w:val="ListParagraph"/>
+        <w:numPr>
+          <w:ilvl w:val="0"/>
+          <w:numId w:val="10"/>
+        </w:numPr>
+      </w:pPr>
+      <w:r>
+        <w:t>The Part 10 speed-up is the largest in the lab because brute-force nearest-neighbour search is almost pure arithmetic, exactly the shape a GPU is built for. Do not generalise it to the other stages.</w:t>
       </w:r>
     </w:p>
     <w:p>

</xml_diff>

<commit_message>
Guide complete: all screenshots, architecture diagram, setup script
</commit_message>
<xml_diff>
--- a/guide/Lab18_Data_Engineering_Pipeline_Lab_Guide.docx
+++ b/guide/Lab18_Data_Engineering_Pipeline_Lab_Guide.docx
@@ -1541,6 +1541,69 @@
     </w:p>
     <w:p>
       <w:pPr>
+        <w:jc w:val="left"/>
+      </w:pPr>
+      <w:r>
+        <w:drawing>
+          <wp:inline xmlns:a="http://schemas.openxmlformats.org/drawingml/2006/main" xmlns:pic="http://schemas.openxmlformats.org/drawingml/2006/picture">
+            <wp:extent cx="6645600" cy="3738150"/>
+            <wp:docPr id="1" name="Picture 1"/>
+            <wp:cNvGraphicFramePr>
+              <a:graphicFrameLocks noChangeAspect="1"/>
+            </wp:cNvGraphicFramePr>
+            <a:graphic>
+              <a:graphicData uri="http://schemas.openxmlformats.org/drawingml/2006/picture">
+                <pic:pic>
+                  <pic:nvPicPr>
+                    <pic:cNvPr id="0" name="00_architecture.png"/>
+                    <pic:cNvPicPr/>
+                  </pic:nvPicPr>
+                  <pic:blipFill>
+                    <a:blip r:embed="rId50"/>
+                    <a:stretch>
+                      <a:fillRect/>
+                    </a:stretch>
+                  </pic:blipFill>
+                  <pic:spPr>
+                    <a:xfrm>
+                      <a:off x="0" y="0"/>
+                      <a:ext cx="6645600" cy="3738150"/>
+                    </a:xfrm>
+                    <a:prstGeom prst="rect"/>
+                    <a:ln w="9525">
+                      <a:solidFill>
+                        <a:srgbClr val="B1B9BE"/>
+                      </a:solidFill>
+                    </a:ln>
+                  </pic:spPr>
+                </pic:pic>
+              </a:graphicData>
+            </a:graphic>
+          </wp:inline>
+        </w:drawing>
+      </w:r>
+    </w:p>
+    <w:p>
+      <w:pPr>
+        <w:pStyle w:val="Caption-Figure"/>
+      </w:pPr>
+      <w:r>
+        <w:rPr>
+          <w:b/>
+        </w:rPr>
+        <w:t xml:space="preserve">Figure 1. </w:t>
+      </w:r>
+      <w:r>
+        <w:t>Lab architecture on HPE Private Cloud AI. Solid arrows carry rows; dashed arrows carry instructions. Airflow sits on a dashed path only.</w:t>
+      </w:r>
+    </w:p>
+    <w:p>
+      <w:r>
+        <w:t>Three things to read from the diagram. Storage is shared and read-only except for each participant's own curated folder and their own MLflow experiment. The orchestrator issues instructions and never handles a row; the 20 million rows move between the shared volume and the Spark job, and the notebook pulls only 30 partitions of them. The notebook is where the two sources finally meet, and everything after that join is a few lines of code.</w:t>
+      </w:r>
+    </w:p>
+    <w:p>
+      <w:pPr>
         <w:pStyle w:val="Heading3"/>
       </w:pPr>
       <w:r>
@@ -2690,7 +2753,7 @@
         <w:drawing>
           <wp:inline xmlns:a="http://schemas.openxmlformats.org/drawingml/2006/main" xmlns:pic="http://schemas.openxmlformats.org/drawingml/2006/picture">
             <wp:extent cx="6645600" cy="3154445"/>
-            <wp:docPr id="1" name="Picture 1"/>
+            <wp:docPr id="2" name="Picture 2"/>
             <wp:cNvGraphicFramePr>
               <a:graphicFrameLocks noChangeAspect="1"/>
             </wp:cNvGraphicFramePr>
@@ -2702,7 +2765,7 @@
                     <pic:cNvPicPr/>
                   </pic:nvPicPr>
                   <pic:blipFill>
-                    <a:blip r:embed="rId50"/>
+                    <a:blip r:embed="rId51"/>
                     <a:stretch>
                       <a:fillRect/>
                     </a:stretch>
@@ -2734,7 +2797,7 @@
         <w:rPr>
           <w:b/>
         </w:rPr>
-        <w:t xml:space="preserve">Figure 1. </w:t>
+        <w:t xml:space="preserve">Figure 2. </w:t>
       </w:r>
       <w:r>
         <w:t>The EzPresto tile under Tools &amp; Frameworks.</w:t>
@@ -2896,7 +2959,7 @@
         <w:drawing>
           <wp:inline xmlns:a="http://schemas.openxmlformats.org/drawingml/2006/main" xmlns:pic="http://schemas.openxmlformats.org/drawingml/2006/picture">
             <wp:extent cx="6645600" cy="3120148"/>
-            <wp:docPr id="2" name="Picture 2"/>
+            <wp:docPr id="3" name="Picture 3"/>
             <wp:cNvGraphicFramePr>
               <a:graphicFrameLocks noChangeAspect="1"/>
             </wp:cNvGraphicFramePr>
@@ -2908,7 +2971,7 @@
                     <pic:cNvPicPr/>
                   </pic:nvPicPr>
                   <pic:blipFill>
-                    <a:blip r:embed="rId51"/>
+                    <a:blip r:embed="rId52"/>
                     <a:stretch>
                       <a:fillRect/>
                     </a:stretch>
@@ -2940,7 +3003,7 @@
         <w:rPr>
           <w:b/>
         </w:rPr>
-        <w:t xml:space="preserve">Figure 2. </w:t>
+        <w:t xml:space="preserve">Figure 3. </w:t>
       </w:r>
       <w:r>
         <w:t>Data Catalog. Expand dataengineeringlab, tick public, and select the subscribers table.</w:t>
@@ -2996,7 +3059,7 @@
         <w:drawing>
           <wp:inline xmlns:a="http://schemas.openxmlformats.org/drawingml/2006/main" xmlns:pic="http://schemas.openxmlformats.org/drawingml/2006/picture">
             <wp:extent cx="6645600" cy="3143330"/>
-            <wp:docPr id="3" name="Picture 3"/>
+            <wp:docPr id="4" name="Picture 4"/>
             <wp:cNvGraphicFramePr>
               <a:graphicFrameLocks noChangeAspect="1"/>
             </wp:cNvGraphicFramePr>
@@ -3008,7 +3071,7 @@
                     <pic:cNvPicPr/>
                   </pic:nvPicPr>
                   <pic:blipFill>
-                    <a:blip r:embed="rId52"/>
+                    <a:blip r:embed="rId53"/>
                     <a:stretch>
                       <a:fillRect/>
                     </a:stretch>
@@ -3040,7 +3103,7 @@
         <w:rPr>
           <w:b/>
         </w:rPr>
-        <w:t xml:space="preserve">Figure 3. </w:t>
+        <w:t xml:space="preserve">Figure 4. </w:t>
       </w:r>
       <w:r>
         <w:t>The Selected Datasets panel. Query Editor opens a worksheet on the selected table.</w:t>
@@ -3183,7 +3246,7 @@
         <w:drawing>
           <wp:inline xmlns:a="http://schemas.openxmlformats.org/drawingml/2006/main" xmlns:pic="http://schemas.openxmlformats.org/drawingml/2006/picture">
             <wp:extent cx="6645600" cy="3175313"/>
-            <wp:docPr id="4" name="Picture 4"/>
+            <wp:docPr id="5" name="Picture 5"/>
             <wp:cNvGraphicFramePr>
               <a:graphicFrameLocks noChangeAspect="1"/>
             </wp:cNvGraphicFramePr>
@@ -3195,7 +3258,7 @@
                     <pic:cNvPicPr/>
                   </pic:nvPicPr>
                   <pic:blipFill>
-                    <a:blip r:embed="rId53"/>
+                    <a:blip r:embed="rId54"/>
                     <a:stretch>
                       <a:fillRect/>
                     </a:stretch>
@@ -3227,7 +3290,7 @@
         <w:rPr>
           <w:b/>
         </w:rPr>
-        <w:t xml:space="preserve">Figure 4. </w:t>
+        <w:t xml:space="preserve">Figure 5. </w:t>
       </w:r>
       <w:r>
         <w:t>The Query Editor with the base-rate query entered. Run executes it.</w:t>
@@ -3264,7 +3327,7 @@
         <w:drawing>
           <wp:inline xmlns:a="http://schemas.openxmlformats.org/drawingml/2006/main" xmlns:pic="http://schemas.openxmlformats.org/drawingml/2006/picture">
             <wp:extent cx="6645600" cy="3126933"/>
-            <wp:docPr id="5" name="Picture 5"/>
+            <wp:docPr id="6" name="Picture 6"/>
             <wp:cNvGraphicFramePr>
               <a:graphicFrameLocks noChangeAspect="1"/>
             </wp:cNvGraphicFramePr>
@@ -3276,7 +3339,7 @@
                     <pic:cNvPicPr/>
                   </pic:nvPicPr>
                   <pic:blipFill>
-                    <a:blip r:embed="rId54"/>
+                    <a:blip r:embed="rId55"/>
                     <a:stretch>
                       <a:fillRect/>
                     </a:stretch>
@@ -3308,7 +3371,7 @@
         <w:rPr>
           <w:b/>
         </w:rPr>
-        <w:t xml:space="preserve">Figure 5. </w:t>
+        <w:t xml:space="preserve">Figure 6. </w:t>
       </w:r>
       <w:r>
         <w:t>Query Results. Each statement you run is listed with its status; expand a row to see the values.</w:t>
@@ -5161,7 +5224,7 @@
         <w:drawing>
           <wp:inline xmlns:a="http://schemas.openxmlformats.org/drawingml/2006/main" xmlns:pic="http://schemas.openxmlformats.org/drawingml/2006/picture">
             <wp:extent cx="6645600" cy="3144003"/>
-            <wp:docPr id="6" name="Picture 6"/>
+            <wp:docPr id="7" name="Picture 7"/>
             <wp:cNvGraphicFramePr>
               <a:graphicFrameLocks noChangeAspect="1"/>
             </wp:cNvGraphicFramePr>
@@ -5173,7 +5236,7 @@
                     <pic:cNvPicPr/>
                   </pic:nvPicPr>
                   <pic:blipFill>
-                    <a:blip r:embed="rId55"/>
+                    <a:blip r:embed="rId56"/>
                     <a:stretch>
                       <a:fillRect/>
                     </a:stretch>
@@ -5205,7 +5268,7 @@
         <w:rPr>
           <w:b/>
         </w:rPr>
-        <w:t xml:space="preserve">Figure 6. </w:t>
+        <w:t xml:space="preserve">Figure 7. </w:t>
       </w:r>
       <w:r>
         <w:t>Tools &amp; Frameworks. The Airflow tile and its Open button.</w:t>
@@ -5313,7 +5376,7 @@
         <w:drawing>
           <wp:inline xmlns:a="http://schemas.openxmlformats.org/drawingml/2006/main" xmlns:pic="http://schemas.openxmlformats.org/drawingml/2006/picture">
             <wp:extent cx="6645600" cy="3179092"/>
-            <wp:docPr id="7" name="Picture 7"/>
+            <wp:docPr id="8" name="Picture 8"/>
             <wp:cNvGraphicFramePr>
               <a:graphicFrameLocks noChangeAspect="1"/>
             </wp:cNvGraphicFramePr>
@@ -5325,7 +5388,7 @@
                     <pic:cNvPicPr/>
                   </pic:nvPicPr>
                   <pic:blipFill>
-                    <a:blip r:embed="rId56"/>
+                    <a:blip r:embed="rId57"/>
                     <a:stretch>
                       <a:fillRect/>
                     </a:stretch>
@@ -5357,7 +5420,7 @@
         <w:rPr>
           <w:b/>
         </w:rPr>
-        <w:t xml:space="preserve">Figure 7. </w:t>
+        <w:t xml:space="preserve">Figure 8. </w:t>
       </w:r>
       <w:r>
         <w:t>The Airflow DAG list. The churn_pipeline toggle is on, and the play button under Actions opens the trigger form.</w:t>
@@ -5371,7 +5434,7 @@
         <w:drawing>
           <wp:inline xmlns:a="http://schemas.openxmlformats.org/drawingml/2006/main" xmlns:pic="http://schemas.openxmlformats.org/drawingml/2006/picture">
             <wp:extent cx="6645600" cy="3201684"/>
-            <wp:docPr id="8" name="Picture 8"/>
+            <wp:docPr id="9" name="Picture 9"/>
             <wp:cNvGraphicFramePr>
               <a:graphicFrameLocks noChangeAspect="1"/>
             </wp:cNvGraphicFramePr>
@@ -5383,7 +5446,7 @@
                     <pic:cNvPicPr/>
                   </pic:nvPicPr>
                   <pic:blipFill>
-                    <a:blip r:embed="rId57"/>
+                    <a:blip r:embed="rId58"/>
                     <a:stretch>
                       <a:fillRect/>
                     </a:stretch>
@@ -5415,7 +5478,7 @@
         <w:rPr>
           <w:b/>
         </w:rPr>
-        <w:t xml:space="preserve">Figure 8. </w:t>
+        <w:t xml:space="preserve">Figure 9. </w:t>
       </w:r>
       <w:r>
         <w:t>The trigger form. Enter your student number in the Student number field and click Trigger.</w:t>
@@ -5670,7 +5733,7 @@
         <w:drawing>
           <wp:inline xmlns:a="http://schemas.openxmlformats.org/drawingml/2006/main" xmlns:pic="http://schemas.openxmlformats.org/drawingml/2006/picture">
             <wp:extent cx="6645600" cy="3158133"/>
-            <wp:docPr id="9" name="Picture 9"/>
+            <wp:docPr id="10" name="Picture 10"/>
             <wp:cNvGraphicFramePr>
               <a:graphicFrameLocks noChangeAspect="1"/>
             </wp:cNvGraphicFramePr>
@@ -5682,7 +5745,7 @@
                     <pic:cNvPicPr/>
                   </pic:nvPicPr>
                   <pic:blipFill>
-                    <a:blip r:embed="rId58"/>
+                    <a:blip r:embed="rId59"/>
                     <a:stretch>
                       <a:fillRect/>
                     </a:stretch>
@@ -5714,7 +5777,7 @@
         <w:rPr>
           <w:b/>
         </w:rPr>
-        <w:t xml:space="preserve">Figure 9. </w:t>
+        <w:t xml:space="preserve">Figure 10. </w:t>
       </w:r>
       <w:r>
         <w:t>The Grid view after a successful run. The newest run is selected and its status is success.</w:t>
@@ -5751,7 +5814,7 @@
         <w:drawing>
           <wp:inline xmlns:a="http://schemas.openxmlformats.org/drawingml/2006/main" xmlns:pic="http://schemas.openxmlformats.org/drawingml/2006/picture">
             <wp:extent cx="6645600" cy="3171359"/>
-            <wp:docPr id="10" name="Picture 10"/>
+            <wp:docPr id="11" name="Picture 11"/>
             <wp:cNvGraphicFramePr>
               <a:graphicFrameLocks noChangeAspect="1"/>
             </wp:cNvGraphicFramePr>
@@ -5763,7 +5826,7 @@
                     <pic:cNvPicPr/>
                   </pic:nvPicPr>
                   <pic:blipFill>
-                    <a:blip r:embed="rId59"/>
+                    <a:blip r:embed="rId60"/>
                     <a:stretch>
                       <a:fillRect/>
                     </a:stretch>
@@ -5795,7 +5858,7 @@
         <w:rPr>
           <w:b/>
         </w:rPr>
-        <w:t xml:space="preserve">Figure 10. </w:t>
+        <w:t xml:space="preserve">Figure 11. </w:t>
       </w:r>
       <w:r>
         <w:t>Analytics, Spark Applications in the left navigation.</w:t>
@@ -5823,7 +5886,7 @@
         <w:drawing>
           <wp:inline xmlns:a="http://schemas.openxmlformats.org/drawingml/2006/main" xmlns:pic="http://schemas.openxmlformats.org/drawingml/2006/picture">
             <wp:extent cx="6645600" cy="3199088"/>
-            <wp:docPr id="11" name="Picture 11"/>
+            <wp:docPr id="12" name="Picture 12"/>
             <wp:cNvGraphicFramePr>
               <a:graphicFrameLocks noChangeAspect="1"/>
             </wp:cNvGraphicFramePr>
@@ -5835,7 +5898,7 @@
                     <pic:cNvPicPr/>
                   </pic:nvPicPr>
                   <pic:blipFill>
-                    <a:blip r:embed="rId60"/>
+                    <a:blip r:embed="rId61"/>
                     <a:stretch>
                       <a:fillRect/>
                     </a:stretch>
@@ -5867,7 +5930,7 @@
         <w:rPr>
           <w:b/>
         </w:rPr>
-        <w:t xml:space="preserve">Figure 11. </w:t>
+        <w:t xml:space="preserve">Figure 12. </w:t>
       </w:r>
       <w:r>
         <w:t>The Spark Applications list. The application Airflow created for one participant, curate-student-04, is Completed after 1 minute 49 seconds.</w:t>
@@ -5921,7 +5984,7 @@
         <w:drawing>
           <wp:inline xmlns:a="http://schemas.openxmlformats.org/drawingml/2006/main" xmlns:pic="http://schemas.openxmlformats.org/drawingml/2006/picture">
             <wp:extent cx="6645600" cy="3111223"/>
-            <wp:docPr id="12" name="Picture 12"/>
+            <wp:docPr id="13" name="Picture 13"/>
             <wp:cNvGraphicFramePr>
               <a:graphicFrameLocks noChangeAspect="1"/>
             </wp:cNvGraphicFramePr>
@@ -5933,7 +5996,7 @@
                     <pic:cNvPicPr/>
                   </pic:nvPicPr>
                   <pic:blipFill>
-                    <a:blip r:embed="rId61"/>
+                    <a:blip r:embed="rId62"/>
                     <a:stretch>
                       <a:fillRect/>
                     </a:stretch>
@@ -5965,7 +6028,7 @@
         <w:rPr>
           <w:b/>
         </w:rPr>
-        <w:t xml:space="preserve">Figure 12. </w:t>
+        <w:t xml:space="preserve">Figure 13. </w:t>
       </w:r>
       <w:r>
         <w:t>The curated folder on the shared volume, one sub-folder per participant.</w:t>
@@ -6507,7 +6570,7 @@
         <w:drawing>
           <wp:inline xmlns:a="http://schemas.openxmlformats.org/drawingml/2006/main" xmlns:pic="http://schemas.openxmlformats.org/drawingml/2006/picture">
             <wp:extent cx="6645600" cy="3087573"/>
-            <wp:docPr id="13" name="Picture 13"/>
+            <wp:docPr id="14" name="Picture 14"/>
             <wp:cNvGraphicFramePr>
               <a:graphicFrameLocks noChangeAspect="1"/>
             </wp:cNvGraphicFramePr>
@@ -6519,7 +6582,7 @@
                     <pic:cNvPicPr/>
                   </pic:nvPicPr>
                   <pic:blipFill>
-                    <a:blip r:embed="rId62"/>
+                    <a:blip r:embed="rId63"/>
                     <a:stretch>
                       <a:fillRect/>
                     </a:stretch>
@@ -6551,7 +6614,7 @@
         <w:rPr>
           <w:b/>
         </w:rPr>
-        <w:t xml:space="preserve">Figure 13. </w:t>
+        <w:t xml:space="preserve">Figure 14. </w:t>
       </w:r>
       <w:r>
         <w:t>The Notebooks page. Select your project at the top, then connect to the notebook server assigned to you.</w:t>
@@ -6605,7 +6668,7 @@
         <w:drawing>
           <wp:inline xmlns:a="http://schemas.openxmlformats.org/drawingml/2006/main" xmlns:pic="http://schemas.openxmlformats.org/drawingml/2006/picture">
             <wp:extent cx="6645600" cy="3147550"/>
-            <wp:docPr id="14" name="Picture 14"/>
+            <wp:docPr id="15" name="Picture 15"/>
             <wp:cNvGraphicFramePr>
               <a:graphicFrameLocks noChangeAspect="1"/>
             </wp:cNvGraphicFramePr>
@@ -6617,7 +6680,7 @@
                     <pic:cNvPicPr/>
                   </pic:nvPicPr>
                   <pic:blipFill>
-                    <a:blip r:embed="rId63"/>
+                    <a:blip r:embed="rId64"/>
                     <a:stretch>
                       <a:fillRect/>
                     </a:stretch>
@@ -6649,7 +6712,7 @@
         <w:rPr>
           <w:b/>
         </w:rPr>
-        <w:t xml:space="preserve">Figure 14. </w:t>
+        <w:t xml:space="preserve">Figure 15. </w:t>
       </w:r>
       <w:r>
         <w:t>The JupyterLab file browser. Open the pcai-dataeng-lab folder.</w:t>
@@ -6663,7 +6726,7 @@
         <w:drawing>
           <wp:inline xmlns:a="http://schemas.openxmlformats.org/drawingml/2006/main" xmlns:pic="http://schemas.openxmlformats.org/drawingml/2006/picture">
             <wp:extent cx="6645600" cy="3140610"/>
-            <wp:docPr id="15" name="Picture 15"/>
+            <wp:docPr id="16" name="Picture 16"/>
             <wp:cNvGraphicFramePr>
               <a:graphicFrameLocks noChangeAspect="1"/>
             </wp:cNvGraphicFramePr>
@@ -6675,7 +6738,7 @@
                     <pic:cNvPicPr/>
                   </pic:nvPicPr>
                   <pic:blipFill>
-                    <a:blip r:embed="rId64"/>
+                    <a:blip r:embed="rId65"/>
                     <a:stretch>
                       <a:fillRect/>
                     </a:stretch>
@@ -6707,7 +6770,7 @@
         <w:rPr>
           <w:b/>
         </w:rPr>
-        <w:t xml:space="preserve">Figure 15. </w:t>
+        <w:t xml:space="preserve">Figure 16. </w:t>
       </w:r>
       <w:r>
         <w:t>Inside pcai-dataeng-lab, open the notebooks folder.</w:t>
@@ -6753,7 +6816,7 @@
         <w:drawing>
           <wp:inline xmlns:a="http://schemas.openxmlformats.org/drawingml/2006/main" xmlns:pic="http://schemas.openxmlformats.org/drawingml/2006/picture">
             <wp:extent cx="6645600" cy="3187246"/>
-            <wp:docPr id="16" name="Picture 16"/>
+            <wp:docPr id="17" name="Picture 17"/>
             <wp:cNvGraphicFramePr>
               <a:graphicFrameLocks noChangeAspect="1"/>
             </wp:cNvGraphicFramePr>
@@ -6765,7 +6828,7 @@
                     <pic:cNvPicPr/>
                   </pic:nvPicPr>
                   <pic:blipFill>
-                    <a:blip r:embed="rId65"/>
+                    <a:blip r:embed="rId66"/>
                     <a:stretch>
                       <a:fillRect/>
                     </a:stretch>
@@ -6797,7 +6860,7 @@
         <w:rPr>
           <w:b/>
         </w:rPr>
-        <w:t xml:space="preserve">Figure 16. </w:t>
+        <w:t xml:space="preserve">Figure 17. </w:t>
       </w:r>
       <w:r>
         <w:t>The lab notebook open in JupyterLab, with the Run button in the toolbar.</w:t>
@@ -7826,16 +7889,16 @@
         </w:numPr>
       </w:pPr>
       <w:r>
-        <w:t xml:space="preserve">In the code cell, find the line </w:t>
-      </w:r>
-      <w:r>
-        <w:rPr>
-          <w:rFonts w:ascii="Consolas" w:hAnsi="Consolas"/>
-        </w:rPr>
-        <w:t>STUDENT_ID = 0</w:t>
-      </w:r>
-      <w:r>
-        <w:t>.</w:t>
+        <w:t xml:space="preserve">In the code cell, find the line that begins </w:t>
+      </w:r>
+      <w:r>
+        <w:rPr>
+          <w:rFonts w:ascii="Consolas" w:hAnsi="Consolas"/>
+        </w:rPr>
+        <w:t>STUDENT_ID =</w:t>
+      </w:r>
+      <w:r>
+        <w:t>. It is the first assignment, marked with the comment CHANGE THIS TO YOUR NUMBER.</w:t>
       </w:r>
     </w:p>
     <w:p>
@@ -7847,16 +7910,7 @@
         </w:numPr>
       </w:pPr>
       <w:r>
-        <w:t xml:space="preserve">Replace the </w:t>
-      </w:r>
-      <w:r>
-        <w:rPr>
-          <w:rFonts w:ascii="Consolas" w:hAnsi="Consolas"/>
-        </w:rPr>
-        <w:t>0</w:t>
-      </w:r>
-      <w:r>
-        <w:t xml:space="preserve"> with your own student number, without leading zeros. Student 7 types </w:t>
+        <w:t xml:space="preserve">Replace the value after the equals sign with your own student number, without leading zeros. Student 7 types </w:t>
       </w:r>
       <w:r>
         <w:rPr>
@@ -7865,7 +7919,7 @@
         <w:t>7</w:t>
       </w:r>
       <w:r>
-        <w:t>.</w:t>
+        <w:t>. The line below it pads the number to two digits for you.</w:t>
       </w:r>
     </w:p>
     <w:p>
@@ -7880,46 +7934,50 @@
         <w:t>Run the cell.</w:t>
       </w:r>
     </w:p>
-    <w:tbl>
-      <w:tblPr>
-        <w:tblW w:type="auto" w:w="0"/>
+    <w:p>
+      <w:pPr>
         <w:jc w:val="left"/>
-        <w:tblBorders>
-          <w:top w:val="single" w:sz="4" w:space="0" w:color="B1B9BE"/>
-          <w:left w:val="single" w:sz="4" w:space="0" w:color="B1B9BE"/>
-          <w:bottom w:val="single" w:sz="4" w:space="0" w:color="B1B9BE"/>
-          <w:right w:val="single" w:sz="4" w:space="0" w:color="B1B9BE"/>
-          <w:insideH w:val="single" w:sz="4" w:space="0" w:color="B1B9BE"/>
-          <w:insideV w:val="single" w:sz="4" w:space="0" w:color="B1B9BE"/>
-        </w:tblBorders>
-        <w:tblLook w:firstColumn="1" w:firstRow="1" w:lastColumn="0" w:lastRow="0" w:noHBand="0" w:noVBand="1" w:val="04A0"/>
-      </w:tblPr>
-      <w:tblGrid>
-        <w:gridCol w:w="10466"/>
-      </w:tblGrid>
-      <w:tr>
-        <w:tc>
-          <w:tcPr>
-            <w:tcW w:type="dxa" w:w="10466"/>
-            <w:shd w:val="clear" w:color="auto" w:fill="F2F4F5"/>
-          </w:tcPr>
-          <w:p>
-            <w:pPr>
-              <w:spacing w:before="1200" w:after="1200"/>
-              <w:jc w:val="center"/>
-            </w:pPr>
-            <w:r>
-              <w:rPr>
-                <w:i/>
-                <w:color w:val="595959"/>
-                <w:sz w:val="18"/>
-              </w:rPr>
-              <w:t>Screenshot to be inserted: 09c_student_id.png</w:t>
-            </w:r>
-          </w:p>
-        </w:tc>
-      </w:tr>
-    </w:tbl>
+      </w:pPr>
+      <w:r>
+        <w:drawing>
+          <wp:inline xmlns:a="http://schemas.openxmlformats.org/drawingml/2006/main" xmlns:pic="http://schemas.openxmlformats.org/drawingml/2006/picture">
+            <wp:extent cx="6645600" cy="3144267"/>
+            <wp:docPr id="18" name="Picture 18"/>
+            <wp:cNvGraphicFramePr>
+              <a:graphicFrameLocks noChangeAspect="1"/>
+            </wp:cNvGraphicFramePr>
+            <a:graphic>
+              <a:graphicData uri="http://schemas.openxmlformats.org/drawingml/2006/picture">
+                <pic:pic>
+                  <pic:nvPicPr>
+                    <pic:cNvPr id="0" name="09c_student_id.png"/>
+                    <pic:cNvPicPr/>
+                  </pic:nvPicPr>
+                  <pic:blipFill>
+                    <a:blip r:embed="rId67"/>
+                    <a:stretch>
+                      <a:fillRect/>
+                    </a:stretch>
+                  </pic:blipFill>
+                  <pic:spPr>
+                    <a:xfrm>
+                      <a:off x="0" y="0"/>
+                      <a:ext cx="6645600" cy="3144267"/>
+                    </a:xfrm>
+                    <a:prstGeom prst="rect"/>
+                    <a:ln w="9525">
+                      <a:solidFill>
+                        <a:srgbClr val="B1B9BE"/>
+                      </a:solidFill>
+                    </a:ln>
+                  </pic:spPr>
+                </pic:pic>
+              </a:graphicData>
+            </a:graphic>
+          </wp:inline>
+        </w:drawing>
+      </w:r>
+    </w:p>
     <w:p>
       <w:pPr>
         <w:pStyle w:val="Caption-Figure"/>
@@ -7928,7 +7986,7 @@
         <w:rPr>
           <w:b/>
         </w:rPr>
-        <w:t xml:space="preserve">Figure 17. </w:t>
+        <w:t xml:space="preserve">Figure 18. </w:t>
       </w:r>
       <w:r>
         <w:t>Part 1.2. Replace the value after STUDENT_ID with your own student number before running the cell.</w:t>
@@ -9730,7 +9788,7 @@
         <w:drawing>
           <wp:inline xmlns:a="http://schemas.openxmlformats.org/drawingml/2006/main" xmlns:pic="http://schemas.openxmlformats.org/drawingml/2006/picture">
             <wp:extent cx="6645600" cy="4497691"/>
-            <wp:docPr id="17" name="Picture 17"/>
+            <wp:docPr id="19" name="Picture 19"/>
             <wp:cNvGraphicFramePr>
               <a:graphicFrameLocks noChangeAspect="1"/>
             </wp:cNvGraphicFramePr>
@@ -9742,7 +9800,7 @@
                     <pic:cNvPicPr/>
                   </pic:nvPicPr>
                   <pic:blipFill>
-                    <a:blip r:embed="rId66"/>
+                    <a:blip r:embed="rId68"/>
                     <a:stretch>
                       <a:fillRect/>
                     </a:stretch>
@@ -9774,7 +9832,7 @@
         <w:rPr>
           <w:b/>
         </w:rPr>
-        <w:t xml:space="preserve">Figure 18. </w:t>
+        <w:t xml:space="preserve">Figure 19. </w:t>
       </w:r>
       <w:r>
         <w:t>Part 3 output on the GPU. The same aggregation as the CPU cell, with the measured speed-up and the first rows of the squashed table.</w:t>
@@ -10752,7 +10810,7 @@
         <w:drawing>
           <wp:inline xmlns:a="http://schemas.openxmlformats.org/drawingml/2006/main" xmlns:pic="http://schemas.openxmlformats.org/drawingml/2006/picture">
             <wp:extent cx="6645600" cy="1850031"/>
-            <wp:docPr id="18" name="Picture 18"/>
+            <wp:docPr id="20" name="Picture 20"/>
             <wp:cNvGraphicFramePr>
               <a:graphicFrameLocks noChangeAspect="1"/>
             </wp:cNvGraphicFramePr>
@@ -10764,7 +10822,7 @@
                     <pic:cNvPicPr/>
                   </pic:nvPicPr>
                   <pic:blipFill>
-                    <a:blip r:embed="rId67"/>
+                    <a:blip r:embed="rId69"/>
                     <a:stretch>
                       <a:fillRect/>
                     </a:stretch>
@@ -10796,7 +10854,7 @@
         <w:rPr>
           <w:b/>
         </w:rPr>
-        <w:t xml:space="preserve">Figure 19. </w:t>
+        <w:t xml:space="preserve">Figure 20. </w:t>
       </w:r>
       <w:r>
         <w:t>Part 5b. Every transformation validated before training.</w:t>
@@ -11904,7 +11962,7 @@
         <w:drawing>
           <wp:inline xmlns:a="http://schemas.openxmlformats.org/drawingml/2006/main" xmlns:pic="http://schemas.openxmlformats.org/drawingml/2006/picture">
             <wp:extent cx="6645600" cy="5174360"/>
-            <wp:docPr id="19" name="Picture 19"/>
+            <wp:docPr id="21" name="Picture 21"/>
             <wp:cNvGraphicFramePr>
               <a:graphicFrameLocks noChangeAspect="1"/>
             </wp:cNvGraphicFramePr>
@@ -11916,7 +11974,7 @@
                     <pic:cNvPicPr/>
                   </pic:nvPicPr>
                   <pic:blipFill>
-                    <a:blip r:embed="rId68"/>
+                    <a:blip r:embed="rId70"/>
                     <a:stretch>
                       <a:fillRect/>
                     </a:stretch>
@@ -11948,7 +12006,7 @@
         <w:rPr>
           <w:b/>
         </w:rPr>
-        <w:t xml:space="preserve">Figure 20. </w:t>
+        <w:t xml:space="preserve">Figure 21. </w:t>
       </w:r>
       <w:r>
         <w:t>Part 7 output. The feature importance with the noise fingerprint: six country columns within 0.002 of each other.</w:t>
@@ -12321,7 +12379,7 @@
         <w:drawing>
           <wp:inline xmlns:a="http://schemas.openxmlformats.org/drawingml/2006/main" xmlns:pic="http://schemas.openxmlformats.org/drawingml/2006/picture">
             <wp:extent cx="6645600" cy="1545261"/>
-            <wp:docPr id="20" name="Picture 20"/>
+            <wp:docPr id="22" name="Picture 22"/>
             <wp:cNvGraphicFramePr>
               <a:graphicFrameLocks noChangeAspect="1"/>
             </wp:cNvGraphicFramePr>
@@ -12333,7 +12391,7 @@
                     <pic:cNvPicPr/>
                   </pic:nvPicPr>
                   <pic:blipFill>
-                    <a:blip r:embed="rId69"/>
+                    <a:blip r:embed="rId71"/>
                     <a:stretch>
                       <a:fillRect/>
                     </a:stretch>
@@ -12365,7 +12423,7 @@
         <w:rPr>
           <w:b/>
         </w:rPr>
-        <w:t xml:space="preserve">Figure 21. </w:t>
+        <w:t xml:space="preserve">Figure 22. </w:t>
       </w:r>
       <w:r>
         <w:t>Part 8 output. The warnings are expected. Running the cell again creates the next version of the same registered model.</w:t>
@@ -12525,7 +12583,7 @@
         <w:drawing>
           <wp:inline xmlns:a="http://schemas.openxmlformats.org/drawingml/2006/main" xmlns:pic="http://schemas.openxmlformats.org/drawingml/2006/picture">
             <wp:extent cx="6645600" cy="3158165"/>
-            <wp:docPr id="21" name="Picture 21"/>
+            <wp:docPr id="23" name="Picture 23"/>
             <wp:cNvGraphicFramePr>
               <a:graphicFrameLocks noChangeAspect="1"/>
             </wp:cNvGraphicFramePr>
@@ -12537,7 +12595,7 @@
                     <pic:cNvPicPr/>
                   </pic:nvPicPr>
                   <pic:blipFill>
-                    <a:blip r:embed="rId70"/>
+                    <a:blip r:embed="rId72"/>
                     <a:stretch>
                       <a:fillRect/>
                     </a:stretch>
@@ -12569,7 +12627,7 @@
         <w:rPr>
           <w:b/>
         </w:rPr>
-        <w:t xml:space="preserve">Figure 22. </w:t>
+        <w:t xml:space="preserve">Figure 23. </w:t>
       </w:r>
       <w:r>
         <w:t>The MLflow tile under Tools &amp; Frameworks.</w:t>
@@ -12583,7 +12641,7 @@
         <w:drawing>
           <wp:inline xmlns:a="http://schemas.openxmlformats.org/drawingml/2006/main" xmlns:pic="http://schemas.openxmlformats.org/drawingml/2006/picture">
             <wp:extent cx="6645600" cy="3159952"/>
-            <wp:docPr id="22" name="Picture 22"/>
+            <wp:docPr id="24" name="Picture 24"/>
             <wp:cNvGraphicFramePr>
               <a:graphicFrameLocks noChangeAspect="1"/>
             </wp:cNvGraphicFramePr>
@@ -12595,7 +12653,7 @@
                     <pic:cNvPicPr/>
                   </pic:nvPicPr>
                   <pic:blipFill>
-                    <a:blip r:embed="rId71"/>
+                    <a:blip r:embed="rId73"/>
                     <a:stretch>
                       <a:fillRect/>
                     </a:stretch>
@@ -12627,7 +12685,7 @@
         <w:rPr>
           <w:b/>
         </w:rPr>
-        <w:t xml:space="preserve">Figure 23. </w:t>
+        <w:t xml:space="preserve">Figure 24. </w:t>
       </w:r>
       <w:r>
         <w:t>MLflow Experiments. Search for your student number and open your experiment.</w:t>
@@ -12641,7 +12699,7 @@
         <w:drawing>
           <wp:inline xmlns:a="http://schemas.openxmlformats.org/drawingml/2006/main" xmlns:pic="http://schemas.openxmlformats.org/drawingml/2006/picture">
             <wp:extent cx="6645600" cy="3158133"/>
-            <wp:docPr id="23" name="Picture 23"/>
+            <wp:docPr id="25" name="Picture 25"/>
             <wp:cNvGraphicFramePr>
               <a:graphicFrameLocks noChangeAspect="1"/>
             </wp:cNvGraphicFramePr>
@@ -12653,7 +12711,7 @@
                     <pic:cNvPicPr/>
                   </pic:nvPicPr>
                   <pic:blipFill>
-                    <a:blip r:embed="rId72"/>
+                    <a:blip r:embed="rId74"/>
                     <a:stretch>
                       <a:fillRect/>
                     </a:stretch>
@@ -12685,7 +12743,7 @@
         <w:rPr>
           <w:b/>
         </w:rPr>
-        <w:t xml:space="preserve">Figure 24. </w:t>
+        <w:t xml:space="preserve">Figure 25. </w:t>
       </w:r>
       <w:r>
         <w:t>The run Overview. Tags, source, the logged model and the registered model version are all recorded.</w:t>
@@ -12699,7 +12757,7 @@
         <w:drawing>
           <wp:inline xmlns:a="http://schemas.openxmlformats.org/drawingml/2006/main" xmlns:pic="http://schemas.openxmlformats.org/drawingml/2006/picture">
             <wp:extent cx="6645600" cy="3142627"/>
-            <wp:docPr id="24" name="Picture 24"/>
+            <wp:docPr id="26" name="Picture 26"/>
             <wp:cNvGraphicFramePr>
               <a:graphicFrameLocks noChangeAspect="1"/>
             </wp:cNvGraphicFramePr>
@@ -12711,7 +12769,7 @@
                     <pic:cNvPicPr/>
                   </pic:nvPicPr>
                   <pic:blipFill>
-                    <a:blip r:embed="rId73"/>
+                    <a:blip r:embed="rId75"/>
                     <a:stretch>
                       <a:fillRect/>
                     </a:stretch>
@@ -12743,7 +12801,7 @@
         <w:rPr>
           <w:b/>
         </w:rPr>
-        <w:t xml:space="preserve">Figure 25. </w:t>
+        <w:t xml:space="preserve">Figure 26. </w:t>
       </w:r>
       <w:r>
         <w:t>The Model metrics tab with the auc value.</w:t>
@@ -13581,7 +13639,7 @@
         <w:drawing>
           <wp:inline xmlns:a="http://schemas.openxmlformats.org/drawingml/2006/main" xmlns:pic="http://schemas.openxmlformats.org/drawingml/2006/picture">
             <wp:extent cx="6645600" cy="2200308"/>
-            <wp:docPr id="25" name="Picture 25"/>
+            <wp:docPr id="27" name="Picture 27"/>
             <wp:cNvGraphicFramePr>
               <a:graphicFrameLocks noChangeAspect="1"/>
             </wp:cNvGraphicFramePr>
@@ -13593,7 +13651,7 @@
                     <pic:cNvPicPr/>
                   </pic:nvPicPr>
                   <pic:blipFill>
-                    <a:blip r:embed="rId74"/>
+                    <a:blip r:embed="rId76"/>
                     <a:stretch>
                       <a:fillRect/>
                     </a:stretch>
@@ -13625,7 +13683,7 @@
         <w:rPr>
           <w:b/>
         </w:rPr>
-        <w:t xml:space="preserve">Figure 26. </w:t>
+        <w:t xml:space="preserve">Figure 27. </w:t>
       </w:r>
       <w:r>
         <w:t>Part 9 output on the reference L40S run. Accuracy agrees, then the clock is compared against the four CPU cores of the notebook.</w:t>
@@ -14493,7 +14551,7 @@
         <w:drawing>
           <wp:inline xmlns:a="http://schemas.openxmlformats.org/drawingml/2006/main" xmlns:pic="http://schemas.openxmlformats.org/drawingml/2006/picture">
             <wp:extent cx="6645600" cy="2184950"/>
-            <wp:docPr id="26" name="Picture 26"/>
+            <wp:docPr id="28" name="Picture 28"/>
             <wp:cNvGraphicFramePr>
               <a:graphicFrameLocks noChangeAspect="1"/>
             </wp:cNvGraphicFramePr>
@@ -14505,7 +14563,7 @@
                     <pic:cNvPicPr/>
                   </pic:nvPicPr>
                   <pic:blipFill>
-                    <a:blip r:embed="rId75"/>
+                    <a:blip r:embed="rId77"/>
                     <a:stretch>
                       <a:fillRect/>
                     </a:stretch>
@@ -14537,7 +14595,7 @@
         <w:rPr>
           <w:b/>
         </w:rPr>
-        <w:t xml:space="preserve">Figure 27. </w:t>
+        <w:t xml:space="preserve">Figure 28. </w:t>
       </w:r>
       <w:r>
         <w:t>Part 10 output on the reference L40S run. The GPU found the same neighbours, 85 times faster than four CPU cores.</w:t>

</xml_diff>